<commit_message>
docs(acta): update Acta de Reunión 04 con el plan de iteraciones completo
Refleja la elaboración de los 14 Planes de Iteración individuales
(Sprint 0 a Sprint 13), la actualización v1.1 del Plan de Iteración
General consolidado, y la ejecución funcional del Sprint 13 (API de
interoperabilidad MINSA/SINADEF e integración wearables-IA).

Co-Authored-By: Claude Sonnet 5 <noreply@anthropic.com>
</commit_message>
<xml_diff>
--- a/Documentation/actas/Acta_Reunion_4.docx
+++ b/Documentation/actas/Acta_Reunion_4.docx
@@ -488,7 +488,7 @@
           </w:tcPr>
           <w:p>
             <w:r>
-              <w:t>Elaboración del Plan de Iteración (Semana 4): verificación y sustento del uso previo de sprints/iteraciones en el proyecto, elaboración del Plan de Iteración para el Sprint 3 (EPIC-04 y EPIC-05) y elaboración del Plan de Iteración General consolidado para las 13 iteraciones del proyecto completo (Sprint 0 a Sprint 12)</w:t>
+              <w:t>Elaboración del Plan de Iteración (Semana 4): verificación y sustento del uso previo de sprints/iteraciones en el proyecto, elaboración de los Planes de Iteración individuales para las 14 iteraciones del proyecto (Sprint 0 a Sprint 13), elaboración y actualización del Plan de Iteración General consolidado del proyecto completo, y ejecución funcional del Sprint 13 (API de interoperabilidad MINSA/SINADEF e integración wearables-IA)</w:t>
             </w:r>
           </w:p>
         </w:tc>
@@ -553,11 +553,13 @@
             <w:r>
               <w:t>Punto 1: Verificación y sustento de sprints/iteraciones ya utilizados en el proyecto</w:t>
               <w:br/>
-              <w:t>Punto 2: Elaboración del Plan de Iteración para el Sprint 3 (EPIC-04: Módulo de Citas Médicas y Agenda; EPIC-05: Sistema de Alertas y Notificaciones Críticas)</w:t>
-              <w:br/>
-              <w:t>Punto 3: Elaboración del Plan de Iteración General consolidado del proyecto completo (Sprint 0 a Sprint 12, 13 iteraciones)</w:t>
-              <w:br/>
-              <w:t>Punto 4: Verificación de consistencia y cierre de los documentos generados</w:t>
+              <w:t>Punto 2: Elaboración de los Planes de Iteración individuales para las 14 iteraciones del proyecto (Sprint 0 a Sprint 13)</w:t>
+              <w:br/>
+              <w:t>Punto 3: Elaboración y actualización del Plan de Iteración General consolidado del proyecto completo (Sprint 0 a Sprint 13)</w:t>
+              <w:br/>
+              <w:t>Punto 4: Ejecución funcional del Sprint 13 (API de interoperabilidad MINSA/SINADEF e integración wearables-IA), con pruebas automatizadas</w:t>
+              <w:br/>
+              <w:t>Punto 5: Verificación de consistencia y cierre de los documentos generados</w:t>
             </w:r>
           </w:p>
         </w:tc>
@@ -629,48 +631,61 @@
               <w:br/>
               <w:t>Compromisos:</w:t>
               <w:br/>
-              <w:t>Sustento verificado y citado explícitamente en ambos documentos de Plan de Iteración generados</w:t>
+              <w:t>Sustento verificado y citado explícitamente en todos los documentos de Plan de Iteración generados</w:t>
               <w:br/>
               <w:t>Hallazgo comunicado al equipo: coexisten dos narrativas de sprint distintas en la documentación del proyecto</w:t>
               <w:br/>
               <w:br/>
               <w:br/>
-              <w:t>Sobre Punto 2: Elaboración del Plan de Iteración para el Sprint 3 (EPIC-04/EPIC-05)</w:t>
-              <w:br/>
-              <w:t>Explicación: Usando la plantilla corporativa Plan_Iteracion_Corporativo_Avanzado.docx, se elaboró el Plan de Iteración para la siguiente iteración lógica del módulo de diagnóstico (EPIC-04: disponibilidad/reprogramación/recordatorios de citas vía AppointmentService; EPIC-05: alertas críticas vía AlertService), incorporando directamente los ajustes de la retrospectiva del Sprint 2 (mantenimiento de dependencias, horas adicionales de testing, arranque en paralelo de integraciones de riesgo).</w:t>
+              <w:t>Sobre Punto 2: Elaboración de los Planes de Iteración individuales (Sprint 0 a Sprint 13)</w:t>
+              <w:br/>
+              <w:t>Explicación: A partir del Plan de Iteración del Sprint 3 ya elaborado (EPIC-04: Módulo de Citas Médicas y Agenda; EPIC-05: Sistema de Alertas y Notificaciones Críticas), se completó la serie con los 13 Planes de Iteración individuales restantes (Sprint 0, 1, 2, 4, 5, 6, 7, 8, 9, 10, 11, 12 y 13), usando la misma plantilla corporativa Plan_Iteracion_Corporativo_Avanzado.docx. Cada plan incluye objetivo, alcance, cronograma, riesgos, criterios de aceptación, evidencias e indicadores propios, sustentados en el contenido real documentado por iteración en METODOLOGIA_AGIL_PROYECTO.md.</w:t>
               <w:br/>
               <w:br/>
               <w:t>Compromisos:</w:t>
               <w:br/>
-              <w:t>Documento entregado: Documentation/informes/Plan_Iteracion_Sprint3_RespiCare.docx y .md</w:t>
-              <w:br/>
-              <w:t>Contenido verificado contra código real (AppointmentService, AlertService) vía graphify explain</w:t>
-              <w:br/>
-              <w:br/>
-              <w:br/>
-              <w:t>Sobre Punto 3: Elaboración del Plan de Iteración General consolidado del proyecto completo</w:t>
-              <w:br/>
-              <w:t>Explicación: A solicitud expresa de consolidar todos los sprints en un solo documento, se generó un segundo Plan de Iteración usando la misma plantilla corporativa, esta vez cubriendo las 13 iteraciones reales del proyecto (Sprint 0 a Sprint 12) documentadas en METODOLOGIA_AGIL_PROYECTO.md, incluyendo cronograma de 26 semanas, entregables por sprint, riesgos, criterios de aceptación y las métricas finales reales del proyecto (12/10 sprints completados, 278/240 story points, 99.81% ML accuracy, entre otras).</w:t>
+              <w:t>Documentos entregados: Plan_Iteracion_Sprint0_RespiCare a Plan_Iteracion_Sprint13_RespiCare (.docx y .md), 14 iteraciones completas en Documentation/informes/</w:t>
+              <w:br/>
+              <w:t>Contenido de cada plan verificado contra el código y los entregables reales de la iteración correspondiente (backend, frontend, mobile, ai-services)</w:t>
+              <w:br/>
+              <w:br/>
+              <w:br/>
+              <w:t>Sobre Punto 3: Elaboración y actualización del Plan de Iteración General consolidado</w:t>
+              <w:br/>
+              <w:t>Explicación: Se mantuvo el documento consolidado Plan_Iteracion_Proyecto_RespiCare (v1.0, 13 iteraciones Sprint 0 a Sprint 12) y se generó la versión 1.1, que incorpora el Sprint 13 como extensión formal de alcance (API de interoperabilidad MINSA/SINADEF e integración wearables-IA), actualizando entregables, cronograma (semanas 27-28), riesgos y criterios de aceptación para reflejar dicha extensión.</w:t>
               <w:br/>
               <w:br/>
               <w:t>Compromisos:</w:t>
               <w:br/>
-              <w:t>Documento entregado: Documentation/informes/Plan_Iteracion_Proyecto_RespiCare.docx y .md</w:t>
-              <w:br/>
-              <w:t>Verificación automatizada de ausencia de texto placeholder ("Guía de llenado"/"Ejemplo") en el documento final</w:t>
-              <w:br/>
-              <w:br/>
-              <w:br/>
-              <w:t>Sobre Punto 4: Verificación de consistencia y cierre</w:t>
-              <w:br/>
-              <w:t>Explicación: Se verificó mediante extracción de texto y tablas que ambos documentos (Sprint 3 y consolidado de proyecto) no contienen texto de plantilla sin reemplazar, y que las tablas de entregables, cronograma, riesgos, evidencias e indicadores tienen el número correcto de filas para el contenido real (sin filas vacías sobrantes ni contenido faltante).</w:t>
+              <w:t>Documento actualizado: Documentation/informes/Plan_Iteracion_Proyecto_RespiCare.docx y .md (v1.1)</w:t>
+              <w:br/>
+              <w:t>Control de versiones documentado dentro del propio archivo (tabla v1.0 / v1.1)</w:t>
+              <w:br/>
+              <w:br/>
+              <w:br/>
+              <w:t>Sobre Punto 4: Ejecución funcional del Sprint 13</w:t>
+              <w:br/>
+              <w:t>Explicación: Se implementó y probó el alcance funcional del Sprint 13, documentado hasta entonces como pendiente en el Plan de Iteración: (a) API de interoperabilidad institucional MINSA/SINADEF, con autenticación por API key (InstitutionalApiClient con hash bcrypt), auditoría dedicada (InstitutionalAuditLog), rate limiting propio, endpoints de exportación epidemiológica, sincronización de centros de salud y distribución de alertas externas, y script CLI de generación de claves; y (b) integración de wearables con los servicios de IA como capa de validación clínica basada en reglas (MedicalValidationRules.validate_vitals()), documentada explícitamente como ajuste de alcance frente al feature engineering de ML originalmente previsto. Ambos flujos cuentan con pruebas unitarias e de integración propias (18 pruebas nuevas, todas exitosas), y se ejecutó además la suite completa de pruebas del proyecto (ai-services: 2034/2034 pytest; backend: 2479/2488 Jest, con 1 falla no relacionada y de origen ambiental, documentada como tal).</w:t>
               <w:br/>
               <w:br/>
               <w:t>Compromisos:</w:t>
               <w:br/>
+              <w:t>Estado documentado como "En ejecución" (no cerrado) en METODOLOGIA_AGIL_PROYECTO.md y Plan_Iteracion_Sprint13_RespiCare.md, con entregables pendientes explícitos: documentación OpenAPI dedicada para el consumidor externo MINSA y actualización de README/Matriz de Trazabilidad</w:t>
+              <w:br/>
+              <w:t>Responsable: Cesar Fabian Chavez Linares</w:t>
+              <w:br/>
+              <w:br/>
+              <w:br/>
+              <w:t>Sobre Punto 5: Verificación de consistencia y cierre</w:t>
+              <w:br/>
+              <w:t>Explicación: Se verificó mediante extracción de texto y tablas que los 14 Planes de Iteración individuales y el documento consolidado no contienen texto de plantilla sin reemplazar, y que las tablas de entregables, cronograma, riesgos, evidencias e indicadores tienen el número correcto de filas para el contenido real de cada iteración.</w:t>
+              <w:br/>
+              <w:br/>
+              <w:t>Compromisos:</w:t>
+              <w:br/>
               <w:t>Responsable de la elaboración y verificación: Cesar Fabian Chavez Linares</w:t>
               <w:br/>
-              <w:t>Documentos entregados en: Documentation/informes/</w:t>
+              <w:t>Documentos entregados en: Documentation/informes/ y Documentation/actas/</w:t>
             </w:r>
           </w:p>
         </w:tc>

</xml_diff>